<commit_message>
Add mobile nav, closing CTA, and correct the resume
Replace the blanket nav hide below 992px with a working hamburger
menu on both pages: toggles a dropdown, closes on link tap, carries
aria-expanded.

Add a closing CTA to the content page so it ends with a conversion
path rather than the footer.

Update the resume to match the site: Case Planet 101K (was 55K),
personal page 11K (was 12K), and a summary that leads with strategist
experience instead of seeking an internship.

Co-Authored-By: Claude Opus 5 <noreply@anthropic.com>
</commit_message>
<xml_diff>
--- a/assets/C-Abdurabb-Resume.docx
+++ b/assets/C-Abdurabb-Resume.docx
@@ -356,7 +356,7 @@
           <w:rFonts w:ascii="Times New Roman" w:hAnsi="Times New Roman" w:cs="Times New Roman"/>
           <w:color w:val="000000" w:themeColor="text1"/>
         </w:rPr>
-        <w:t>MBA Marketing student with experience in Social Media Marketing, Meta Ads, digital marketing, and content creation. Seeking a Marketing Internship to apply data-driven strategies and grow brand engagement.</w:t>
+        <w:t>Social Media Strategist with 5+ years in organic growth, Meta Ads and short-form content. Founder of Case Planet, scaled to 101K followers and 10,000+ customers from a standing start. Currently driving platform strategy at Eduport across 30+ channels, where total reach grew from 12M to 45M.</w:t>
       </w:r>
     </w:p>
     <w:p>
@@ -1433,7 +1433,7 @@
           <w:rFonts w:ascii="Times New Roman" w:hAnsi="Times New Roman" w:cs="Times New Roman"/>
           <w:color w:val="000000" w:themeColor="text1"/>
         </w:rPr>
-        <w:t>Founded and scaled Case Planet, generating 10,000+ customers and growing the brand to 55K+ Instagram followers through strategic social media marketing and digital campaigns.</w:t>
+        <w:t>Founded and scaled Case Planet, generating 10,000+ customers and growing the brand to 101K+ Instagram followers through strategic social media marketing and digital campaigns.</w:t>
       </w:r>
     </w:p>
     <w:p>
@@ -1588,7 +1588,7 @@
           <w:rFonts w:ascii="Times New Roman" w:hAnsi="Times New Roman" w:cs="Times New Roman"/>
           <w:color w:val="000000" w:themeColor="text1"/>
         </w:rPr>
-        <w:t xml:space="preserve">Scaled a personal Instagram page to 12K+ followers, generating 5M+ total engagements, with 3 viral posts exceeding 1M+ views and 10+ videos crossing 100K+ views through trend-driven </w:t>
+        <w:t xml:space="preserve">Scaled a personal Instagram page to 11K+ followers, generating 5M+ total engagements, with 3 viral posts exceeding 1M+ views and 10+ videos crossing 100K+ views through trend-driven </w:t>
       </w:r>
       <w:r>
         <w:rPr>

</xml_diff>

<commit_message>
Retitle to Social Media Head and add Eduport reach figure
Title updated across the page title, meta description, hero heading,
the Eduport experience card and both places it appears in the resume,
so the site and the CV agree.

Eduport card gains a Reach block: 100M dashboard views across the
channel network, also reflected in the hero bio and network intro.

Co-Authored-By: Claude Opus 5 <noreply@anthropic.com>
</commit_message>
<xml_diff>
--- a/assets/C-Abdurabb-Resume.docx
+++ b/assets/C-Abdurabb-Resume.docx
@@ -356,7 +356,7 @@
           <w:rFonts w:ascii="Times New Roman" w:hAnsi="Times New Roman" w:cs="Times New Roman"/>
           <w:color w:val="000000" w:themeColor="text1"/>
         </w:rPr>
-        <w:t>Social Media Strategist with 5+ years in organic growth, Meta Ads and short-form content. Founder of Case Planet, scaled to 101K followers and 10,000+ customers from a standing start. Currently driving platform strategy at Eduport across 30+ channels, where total reach grew from 12M to 45M.</w:t>
+        <w:t>Social Media Head with 5+ years in organic growth, Meta Ads and short-form content. Founder of Case Planet, scaled to 101K followers and 10,000+ customers from a standing start. Currently driving platform strategy at Eduport across 30+ channels, where total reach grew from 12M to 45M.</w:t>
       </w:r>
     </w:p>
     <w:p>
@@ -680,7 +680,7 @@
           <w:sz w:val="24"/>
           <w:szCs w:val="24"/>
         </w:rPr>
-        <w:t>Social media strategist</w:t>
+        <w:t>Social Media Head</w:t>
       </w:r>
       <w:r>
         <w:rPr>

</xml_diff>